<commit_message>
Document fork PR submission workflow in PRD
</commit_message>
<xml_diff>
--- a/PRD.docx
+++ b/PRD.docx
@@ -2459,7 +2459,499 @@
         <w:pStyle w:val="Heading1"/>
       </w:pPr>
       <w:r>
-        <w:t>12. AI 使用要求</w:t>
+        <w:t>12. GitHub 提交与公开验收流程</w:t>
+      </w:r>
+    </w:p>
+    <w:p>
+      <w:r>
+        <w:t>本项目不使用 GitHub Classroom。学生需要采用与课程实验相同的 GitHub Fork + Pull Request 工作流提交项目。</w:t>
+      </w:r>
+    </w:p>
+    <w:tbl>
+      <w:tblPr>
+        <w:tblStyle w:val="TableGrid"/>
+        <w:tblW w:type="dxa" w:w="10080"/>
+        <w:jc w:val="left"/>
+        <w:tblLayout w:type="fixed"/>
+        <w:tblLook w:firstColumn="1" w:firstRow="1" w:lastColumn="0" w:lastRow="0" w:noHBand="0" w:noVBand="1" w:val="04A0"/>
+      </w:tblPr>
+      <w:tblGrid>
+        <w:gridCol w:w="5040"/>
+        <w:gridCol w:w="5040"/>
+      </w:tblGrid>
+      <w:tr>
+        <w:tc>
+          <w:tcPr>
+            <w:tcW w:type="dxa" w:w="2088"/>
+            <w:vAlign w:val="center"/>
+            <w:tcMar>
+              <w:top w:w="80" w:type="dxa"/>
+              <w:start w:w="120" w:type="dxa"/>
+              <w:bottom w:w="80" w:type="dxa"/>
+              <w:end w:w="120" w:type="dxa"/>
+            </w:tcMar>
+            <w:shd w:fill="F2F4F7"/>
+          </w:tcPr>
+          <w:p>
+            <w:pPr>
+              <w:spacing w:after="0"/>
+            </w:pPr>
+            <w:r>
+              <w:rPr>
+                <w:b/>
+                <w:sz w:val="18"/>
+              </w:rPr>
+              <w:t>项目</w:t>
+            </w:r>
+          </w:p>
+        </w:tc>
+        <w:tc>
+          <w:tcPr>
+            <w:tcW w:type="dxa" w:w="7992"/>
+            <w:vAlign w:val="center"/>
+            <w:tcMar>
+              <w:top w:w="80" w:type="dxa"/>
+              <w:start w:w="120" w:type="dxa"/>
+              <w:bottom w:w="80" w:type="dxa"/>
+              <w:end w:w="120" w:type="dxa"/>
+            </w:tcMar>
+            <w:shd w:fill="F2F4F7"/>
+          </w:tcPr>
+          <w:p>
+            <w:pPr>
+              <w:spacing w:after="0"/>
+            </w:pPr>
+            <w:r>
+              <w:rPr>
+                <w:b/>
+                <w:sz w:val="18"/>
+              </w:rPr>
+              <w:t>要求</w:t>
+            </w:r>
+          </w:p>
+        </w:tc>
+      </w:tr>
+      <w:tr>
+        <w:tc>
+          <w:tcPr>
+            <w:tcW w:type="dxa" w:w="2088"/>
+            <w:tcMar>
+              <w:top w:w="80" w:type="dxa"/>
+              <w:start w:w="120" w:type="dxa"/>
+              <w:bottom w:w="80" w:type="dxa"/>
+              <w:end w:w="120" w:type="dxa"/>
+            </w:tcMar>
+            <w:vAlign w:val="center"/>
+          </w:tcPr>
+          <w:p>
+            <w:pPr>
+              <w:spacing w:after="0"/>
+            </w:pPr>
+            <w:r>
+              <w:rPr>
+                <w:sz w:val="18"/>
+              </w:rPr>
+              <w:t>教师仓库</w:t>
+            </w:r>
+          </w:p>
+        </w:tc>
+        <w:tc>
+          <w:tcPr>
+            <w:tcW w:type="dxa" w:w="7992"/>
+            <w:tcMar>
+              <w:top w:w="80" w:type="dxa"/>
+              <w:start w:w="120" w:type="dxa"/>
+              <w:bottom w:w="80" w:type="dxa"/>
+              <w:end w:w="120" w:type="dxa"/>
+            </w:tcMar>
+            <w:vAlign w:val="center"/>
+          </w:tcPr>
+          <w:p>
+            <w:pPr>
+              <w:spacing w:after="0"/>
+            </w:pPr>
+            <w:r>
+              <w:rPr>
+                <w:sz w:val="18"/>
+              </w:rPr>
+              <w:t>https://github.com/jwentong/wireless-final-project-template</w:t>
+            </w:r>
+          </w:p>
+        </w:tc>
+      </w:tr>
+      <w:tr>
+        <w:tc>
+          <w:tcPr>
+            <w:tcW w:type="dxa" w:w="2088"/>
+            <w:tcMar>
+              <w:top w:w="80" w:type="dxa"/>
+              <w:start w:w="120" w:type="dxa"/>
+              <w:bottom w:w="80" w:type="dxa"/>
+              <w:end w:w="120" w:type="dxa"/>
+            </w:tcMar>
+            <w:vAlign w:val="center"/>
+          </w:tcPr>
+          <w:p>
+            <w:pPr>
+              <w:spacing w:after="0"/>
+            </w:pPr>
+            <w:r>
+              <w:rPr>
+                <w:sz w:val="18"/>
+              </w:rPr>
+              <w:t>提交方式</w:t>
+            </w:r>
+          </w:p>
+        </w:tc>
+        <w:tc>
+          <w:tcPr>
+            <w:tcW w:type="dxa" w:w="7992"/>
+            <w:tcMar>
+              <w:top w:w="80" w:type="dxa"/>
+              <w:start w:w="120" w:type="dxa"/>
+              <w:bottom w:w="80" w:type="dxa"/>
+              <w:end w:w="120" w:type="dxa"/>
+            </w:tcMar>
+            <w:vAlign w:val="center"/>
+          </w:tcPr>
+          <w:p>
+            <w:pPr>
+              <w:spacing w:after="0"/>
+            </w:pPr>
+            <w:r>
+              <w:rPr>
+                <w:sz w:val="18"/>
+              </w:rPr>
+              <w:t>学生 Fork 教师仓库到个人 GitHub 账号，在个人 Fork 中完成项目，然后向教师原仓库创建 Pull Request。</w:t>
+            </w:r>
+          </w:p>
+        </w:tc>
+      </w:tr>
+      <w:tr>
+        <w:tc>
+          <w:tcPr>
+            <w:tcW w:type="dxa" w:w="2088"/>
+            <w:tcMar>
+              <w:top w:w="80" w:type="dxa"/>
+              <w:start w:w="120" w:type="dxa"/>
+              <w:bottom w:w="80" w:type="dxa"/>
+              <w:end w:w="120" w:type="dxa"/>
+            </w:tcMar>
+            <w:vAlign w:val="center"/>
+          </w:tcPr>
+          <w:p>
+            <w:pPr>
+              <w:spacing w:after="0"/>
+            </w:pPr>
+            <w:r>
+              <w:rPr>
+                <w:sz w:val="18"/>
+              </w:rPr>
+              <w:t>PR 标题格式</w:t>
+            </w:r>
+          </w:p>
+        </w:tc>
+        <w:tc>
+          <w:tcPr>
+            <w:tcW w:type="dxa" w:w="7992"/>
+            <w:tcMar>
+              <w:top w:w="80" w:type="dxa"/>
+              <w:start w:w="120" w:type="dxa"/>
+              <w:bottom w:w="80" w:type="dxa"/>
+              <w:end w:w="120" w:type="dxa"/>
+            </w:tcMar>
+            <w:vAlign w:val="center"/>
+          </w:tcPr>
+          <w:p>
+            <w:pPr>
+              <w:spacing w:after="0"/>
+            </w:pPr>
+            <w:r>
+              <w:rPr>
+                <w:sz w:val="18"/>
+              </w:rPr>
+              <w:t>学号-姓名-无线通信期末项目，例如：2023123456-张三-无线通信期末项目。</w:t>
+            </w:r>
+          </w:p>
+        </w:tc>
+      </w:tr>
+      <w:tr>
+        <w:tc>
+          <w:tcPr>
+            <w:tcW w:type="dxa" w:w="2088"/>
+            <w:tcMar>
+              <w:top w:w="80" w:type="dxa"/>
+              <w:start w:w="120" w:type="dxa"/>
+              <w:bottom w:w="80" w:type="dxa"/>
+              <w:end w:w="120" w:type="dxa"/>
+            </w:tcMar>
+            <w:vAlign w:val="center"/>
+          </w:tcPr>
+          <w:p>
+            <w:pPr>
+              <w:spacing w:after="0"/>
+            </w:pPr>
+            <w:r>
+              <w:rPr>
+                <w:sz w:val="18"/>
+              </w:rPr>
+              <w:t>身份信息</w:t>
+            </w:r>
+          </w:p>
+        </w:tc>
+        <w:tc>
+          <w:tcPr>
+            <w:tcW w:type="dxa" w:w="7992"/>
+            <w:tcMar>
+              <w:top w:w="80" w:type="dxa"/>
+              <w:start w:w="120" w:type="dxa"/>
+              <w:bottom w:w="80" w:type="dxa"/>
+              <w:end w:w="120" w:type="dxa"/>
+            </w:tcMar>
+            <w:vAlign w:val="center"/>
+          </w:tcPr>
+          <w:p>
+            <w:pPr>
+              <w:spacing w:after="0"/>
+            </w:pPr>
+            <w:r>
+              <w:rPr>
+                <w:sz w:val="18"/>
+              </w:rPr>
+              <w:t>创建 Pull Request 时必须填写学号、姓名、GitHub 用户名。</w:t>
+            </w:r>
+          </w:p>
+        </w:tc>
+      </w:tr>
+      <w:tr>
+        <w:tc>
+          <w:tcPr>
+            <w:tcW w:type="dxa" w:w="2088"/>
+            <w:tcMar>
+              <w:top w:w="80" w:type="dxa"/>
+              <w:start w:w="120" w:type="dxa"/>
+              <w:bottom w:w="80" w:type="dxa"/>
+              <w:end w:w="120" w:type="dxa"/>
+            </w:tcMar>
+            <w:vAlign w:val="center"/>
+          </w:tcPr>
+          <w:p>
+            <w:pPr>
+              <w:spacing w:after="0"/>
+            </w:pPr>
+            <w:r>
+              <w:rPr>
+                <w:sz w:val="18"/>
+              </w:rPr>
+              <w:t>提交清单</w:t>
+            </w:r>
+          </w:p>
+        </w:tc>
+        <w:tc>
+          <w:tcPr>
+            <w:tcW w:type="dxa" w:w="7992"/>
+            <w:tcMar>
+              <w:top w:w="80" w:type="dxa"/>
+              <w:start w:w="120" w:type="dxa"/>
+              <w:bottom w:w="80" w:type="dxa"/>
+              <w:end w:w="120" w:type="dxa"/>
+            </w:tcMar>
+            <w:vAlign w:val="center"/>
+          </w:tcPr>
+          <w:p>
+            <w:pPr>
+              <w:spacing w:after="0"/>
+            </w:pPr>
+            <w:r>
+              <w:rPr>
+                <w:sz w:val="18"/>
+              </w:rPr>
+              <w:t>PR 模板中必须勾选 DESIGN.md、TEST_PLAN.md、MOCK_TEST_REPORT.md、AI_LOG.md、main.py、src/、tests/、results/ 等完成情况。</w:t>
+            </w:r>
+          </w:p>
+        </w:tc>
+      </w:tr>
+      <w:tr>
+        <w:tc>
+          <w:tcPr>
+            <w:tcW w:type="dxa" w:w="2088"/>
+            <w:tcMar>
+              <w:top w:w="80" w:type="dxa"/>
+              <w:start w:w="120" w:type="dxa"/>
+              <w:bottom w:w="80" w:type="dxa"/>
+              <w:end w:w="120" w:type="dxa"/>
+            </w:tcMar>
+            <w:vAlign w:val="center"/>
+          </w:tcPr>
+          <w:p>
+            <w:pPr>
+              <w:spacing w:after="0"/>
+            </w:pPr>
+            <w:r>
+              <w:rPr>
+                <w:sz w:val="18"/>
+              </w:rPr>
+              <w:t>自动公开验收</w:t>
+            </w:r>
+          </w:p>
+        </w:tc>
+        <w:tc>
+          <w:tcPr>
+            <w:tcW w:type="dxa" w:w="7992"/>
+            <w:tcMar>
+              <w:top w:w="80" w:type="dxa"/>
+              <w:start w:w="120" w:type="dxa"/>
+              <w:bottom w:w="80" w:type="dxa"/>
+              <w:end w:w="120" w:type="dxa"/>
+            </w:tcMar>
+            <w:vAlign w:val="center"/>
+          </w:tcPr>
+          <w:p>
+            <w:pPr>
+              <w:spacing w:after="0"/>
+            </w:pPr>
+            <w:r>
+              <w:rPr>
+                <w:sz w:val="18"/>
+              </w:rPr>
+              <w:t>Pull Request 创建或更新后，教师仓库的 GitHub Actions 会自动运行 public_tests，并在 Actions Summary 或 PR 评论中显示公开测试结果。</w:t>
+            </w:r>
+          </w:p>
+        </w:tc>
+      </w:tr>
+      <w:tr>
+        <w:tc>
+          <w:tcPr>
+            <w:tcW w:type="dxa" w:w="2088"/>
+            <w:tcMar>
+              <w:top w:w="80" w:type="dxa"/>
+              <w:start w:w="120" w:type="dxa"/>
+              <w:bottom w:w="80" w:type="dxa"/>
+              <w:end w:w="120" w:type="dxa"/>
+            </w:tcMar>
+            <w:vAlign w:val="center"/>
+          </w:tcPr>
+          <w:p>
+            <w:pPr>
+              <w:spacing w:after="0"/>
+            </w:pPr>
+            <w:r>
+              <w:rPr>
+                <w:sz w:val="18"/>
+              </w:rPr>
+              <w:t>最终验收</w:t>
+            </w:r>
+          </w:p>
+        </w:tc>
+        <w:tc>
+          <w:tcPr>
+            <w:tcW w:type="dxa" w:w="7992"/>
+            <w:tcMar>
+              <w:top w:w="80" w:type="dxa"/>
+              <w:start w:w="120" w:type="dxa"/>
+              <w:bottom w:w="80" w:type="dxa"/>
+              <w:end w:w="120" w:type="dxa"/>
+            </w:tcMar>
+            <w:vAlign w:val="center"/>
+          </w:tcPr>
+          <w:p>
+            <w:pPr>
+              <w:spacing w:after="0"/>
+            </w:pPr>
+            <w:r>
+              <w:rPr>
+                <w:sz w:val="18"/>
+              </w:rPr>
+              <w:t>公开测试只作为基础检查。教师还将使用隐藏验证集、文档检查和必要的人工复核进行最终评分。</w:t>
+            </w:r>
+          </w:p>
+        </w:tc>
+      </w:tr>
+    </w:tbl>
+    <w:p/>
+    <w:p>
+      <w:r>
+        <w:t>学生提交步骤如下：</w:t>
+      </w:r>
+    </w:p>
+    <w:p>
+      <w:pPr>
+        <w:pStyle w:val="ListNumber"/>
+      </w:pPr>
+      <w:r>
+        <w:t>访问教师仓库 https://github.com/jwentong/wireless-final-project-template。</w:t>
+      </w:r>
+    </w:p>
+    <w:p>
+      <w:pPr>
+        <w:pStyle w:val="ListNumber"/>
+      </w:pPr>
+      <w:r>
+        <w:t>点击 Fork，将仓库复制到自己的 GitHub 账号。</w:t>
+      </w:r>
+    </w:p>
+    <w:p>
+      <w:pPr>
+        <w:pStyle w:val="ListNumber"/>
+      </w:pPr>
+      <w:r>
+        <w:t>Clone 自己 Fork 后的仓库到本地。</w:t>
+      </w:r>
+    </w:p>
+    <w:p>
+      <w:pPr>
+        <w:pStyle w:val="ListNumber"/>
+      </w:pPr>
+      <w:r>
+        <w:t>按照 PRD 完成设计文档、mock 测试报告、AI_LOG 和系统代码。</w:t>
+      </w:r>
+    </w:p>
+    <w:p>
+      <w:pPr>
+        <w:pStyle w:val="ListNumber"/>
+      </w:pPr>
+      <w:r>
+        <w:t>在本地运行 pytest public_tests -q，尽量通过公开测试。</w:t>
+      </w:r>
+    </w:p>
+    <w:p>
+      <w:pPr>
+        <w:pStyle w:val="ListNumber"/>
+      </w:pPr>
+      <w:r>
+        <w:t>将代码 push 到自己的 Fork 仓库。</w:t>
+      </w:r>
+    </w:p>
+    <w:p>
+      <w:pPr>
+        <w:pStyle w:val="ListNumber"/>
+      </w:pPr>
+      <w:r>
+        <w:t>从自己的 Fork 向教师原仓库 main 分支创建 Pull Request。</w:t>
+      </w:r>
+    </w:p>
+    <w:p>
+      <w:pPr>
+        <w:pStyle w:val="ListNumber"/>
+      </w:pPr>
+      <w:r>
+        <w:t>在 PR 模板中填写学号、姓名、GitHub 用户名和提交清单。</w:t>
+      </w:r>
+    </w:p>
+    <w:p>
+      <w:pPr>
+        <w:pStyle w:val="ListNumber"/>
+      </w:pPr>
+      <w:r>
+        <w:t>查看 GitHub Actions 结果，根据公开测试失败信息继续修改并 push。</w:t>
+      </w:r>
+    </w:p>
+    <w:p>
+      <w:pPr>
+        <w:pStyle w:val="Heading1"/>
+      </w:pPr>
+      <w:r>
+        <w:t>13. AI 使用要求</w:t>
       </w:r>
     </w:p>
     <w:p>
@@ -2523,7 +3015,7 @@
         <w:pStyle w:val="Heading1"/>
       </w:pPr>
       <w:r>
-        <w:t>13. 评分标准</w:t>
+        <w:t>14. 评分标准</w:t>
       </w:r>
     </w:p>
     <w:tbl>
@@ -3049,7 +3541,7 @@
         <w:pStyle w:val="Heading1"/>
       </w:pPr>
       <w:r>
-        <w:t>14. 答辩与解释要求</w:t>
+        <w:t>15. 答辩与解释要求</w:t>
       </w:r>
     </w:p>
     <w:p>
@@ -3118,7 +3610,7 @@
         <w:pStyle w:val="Heading1"/>
       </w:pPr>
       <w:r>
-        <w:t>15. 学术诚信与限制</w:t>
+        <w:t>16. 学术诚信与限制</w:t>
       </w:r>
     </w:p>
     <w:p>

</xml_diff>